<commit_message>
Ajustes finales preentrega a repositorio
</commit_message>
<xml_diff>
--- a/fuentes/621602_CF11_DU.docx
+++ b/fuentes/621602_CF11_DU.docx
@@ -205,9 +205,9 @@
               </wp:anchor>
             </w:drawing>
           </mc:Choice>
-          <mc:Fallback xmlns:oel="http://schemas.microsoft.com/office/2019/extlst">
+          <mc:Fallback xmlns:oel="http://schemas.microsoft.com/office/2019/extlst" xmlns:a14="http://schemas.microsoft.com/office/drawing/2010/main" xmlns:pic="http://schemas.openxmlformats.org/drawingml/2006/picture" xmlns:adec="http://schemas.microsoft.com/office/drawing/2017/decorative" xmlns:a="http://schemas.openxmlformats.org/drawingml/2006/main">
             <w:pict>
-              <v:rect w14:anchorId="4C256C62" id="Rectángulo 3" o:spid="_x0000_s1026" alt="&quot;&quot;" style="position:absolute;margin-left:-55.95pt;margin-top:26.4pt;width:613.85pt;height:164.25pt;z-index:-251655168;visibility:visible;mso-wrap-style:square;mso-height-percent:0;mso-wrap-distance-left:9pt;mso-wrap-distance-top:0;mso-wrap-distance-right:9pt;mso-wrap-distance-bottom:0;mso-position-horizontal:absolute;mso-position-horizontal-relative:text;mso-position-vertical:absolute;mso-position-vertical-relative:text;mso-height-percent:0;mso-height-relative:margin;v-text-anchor:middle" o:gfxdata="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" fillcolor="#00314d" stroked="f" strokeweight="1pt"/>
+              <v:rect id="Rectángulo 3" style="position:absolute;margin-left:-55.95pt;margin-top:26.4pt;width:613.85pt;height:164.25pt;z-index:-251655168;visibility:visible;mso-wrap-style:square;mso-height-percent:0;mso-wrap-distance-left:9pt;mso-wrap-distance-top:0;mso-wrap-distance-right:9pt;mso-wrap-distance-bottom:0;mso-position-horizontal:absolute;mso-position-horizontal-relative:text;mso-position-vertical:absolute;mso-position-vertical-relative:text;mso-height-percent:0;mso-height-relative:margin;v-text-anchor:middle" alt="&quot;&quot;" o:spid="_x0000_s1026" fillcolor="#00314d" stroked="f" strokeweight="1pt" w14:anchorId="4C256C62" o:gfxdata="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"/>
             </w:pict>
           </mc:Fallback>
         </mc:AlternateContent>
@@ -828,7 +828,7 @@
                 <w:noProof/>
                 <w:webHidden/>
               </w:rPr>
-              <w:t>16</w:t>
+              <w:t>17</w:t>
             </w:r>
             <w:r>
               <w:rPr>
@@ -901,7 +901,7 @@
                 <w:noProof/>
                 <w:webHidden/>
               </w:rPr>
-              <w:t>21</w:t>
+              <w:t>22</w:t>
             </w:r>
             <w:r>
               <w:rPr>
@@ -974,7 +974,7 @@
                 <w:noProof/>
                 <w:webHidden/>
               </w:rPr>
-              <w:t>24</w:t>
+              <w:t>25</w:t>
             </w:r>
             <w:r>
               <w:rPr>
@@ -1421,7 +1421,19 @@
     </w:p>
     <w:p>
       <w:r>
-        <w:t>La industria turística y hotelera ha pasado por varios periodos de crisis o bonanzas, acorde con esto se han promulgado normas específicas desde un marco normativo tributario. En general un negocio hotelero está obligado a pagar impuestos nacionales (Impuesto al Valor Agregado - IVA, e Impuesto sobre la renta) Impuestos departamentales (Impuesto al consumo – Impoconsumo) Impuestos locales (Industria y Comercio - ICA) y en algunos lugares sobretasas a la explotación turística y hotelera. Conozcamos sobre ellos.</w:t>
+        <w:t xml:space="preserve">La industria turística y hotelera ha pasado por varios periodos de crisis o bonanzas, acorde con esto se han promulgado normas específicas desde un marco normativo tributario. En general un negocio hotelero está obligado a pagar impuestos nacionales (Impuesto al Valor Agregado </w:t>
+      </w:r>
+      <w:r>
+        <w:t>–</w:t>
+      </w:r>
+      <w:r>
+        <w:t xml:space="preserve"> IVA, e Impuesto sobre la renta) Impuestos departamentales (Impuesto al consumo – Impoconsumo) Impuestos locales (Industria y Comercio </w:t>
+      </w:r>
+      <w:r>
+        <w:t>–</w:t>
+      </w:r>
+      <w:r>
+        <w:t xml:space="preserve"> ICA) y en algunos lugares sobretasas a la explotación turística y hotelera. Conozcamos sobre ellos.</w:t>
       </w:r>
     </w:p>
     <w:p>
@@ -1579,7 +1591,13 @@
         <w:pStyle w:val="Tabla"/>
       </w:pPr>
       <w:r>
-        <w:t xml:space="preserve">Impuesto al Valor agregado </w:t>
+        <w:t xml:space="preserve">Impuesto al Valor </w:t>
+      </w:r>
+      <w:r>
+        <w:t>A</w:t>
+      </w:r>
+      <w:r>
+        <w:t xml:space="preserve">gregado </w:t>
       </w:r>
       <w:r>
         <w:t>–</w:t>
@@ -1659,6 +1677,7 @@
             <w:pPr>
               <w:pStyle w:val="Tablas"/>
               <w:rPr>
+                <w:b w:val="0"/>
                 <w:sz w:val="28"/>
                 <w:szCs w:val="28"/>
               </w:rPr>
@@ -1668,7 +1687,23 @@
                 <w:sz w:val="28"/>
                 <w:szCs w:val="28"/>
               </w:rPr>
-              <w:t>Unidad 30 %</w:t>
+              <w:t xml:space="preserve">Unidad </w:t>
+            </w:r>
+          </w:p>
+          <w:p>
+            <w:pPr>
+              <w:pStyle w:val="Tablas"/>
+              <w:rPr>
+                <w:sz w:val="28"/>
+                <w:szCs w:val="28"/>
+              </w:rPr>
+            </w:pPr>
+            <w:r>
+              <w:rPr>
+                <w:sz w:val="28"/>
+                <w:szCs w:val="28"/>
+              </w:rPr>
+              <w:t>30 %</w:t>
             </w:r>
           </w:p>
         </w:tc>
@@ -1701,6 +1736,7 @@
             <w:pPr>
               <w:pStyle w:val="Tablas"/>
               <w:rPr>
+                <w:b w:val="0"/>
                 <w:sz w:val="28"/>
                 <w:szCs w:val="28"/>
               </w:rPr>
@@ -1710,7 +1746,23 @@
                 <w:sz w:val="28"/>
                 <w:szCs w:val="28"/>
               </w:rPr>
-              <w:t>IVA 19 %</w:t>
+              <w:t xml:space="preserve">IVA </w:t>
+            </w:r>
+          </w:p>
+          <w:p>
+            <w:pPr>
+              <w:pStyle w:val="Tablas"/>
+              <w:rPr>
+                <w:sz w:val="28"/>
+                <w:szCs w:val="28"/>
+              </w:rPr>
+            </w:pPr>
+            <w:r>
+              <w:rPr>
+                <w:sz w:val="28"/>
+                <w:szCs w:val="28"/>
+              </w:rPr>
+              <w:t>19 %</w:t>
             </w:r>
           </w:p>
         </w:tc>
@@ -2543,7 +2595,13 @@
     </w:p>
     <w:p>
       <w:r>
-        <w:t>Nota: Este impuesto no es aplicable a las actividades de expendio de bebidas y comidas bajo franquicias.</w:t>
+        <w:t xml:space="preserve">Nota: </w:t>
+      </w:r>
+      <w:r>
+        <w:t>e</w:t>
+      </w:r>
+      <w:r>
+        <w:t>ste impuesto no es aplicable a las actividades de expendio de bebidas y comidas bajo franquicias.</w:t>
       </w:r>
     </w:p>
     <w:p>
@@ -3133,101 +3191,149 @@
     </w:p>
     <w:p>
       <w:pPr>
+        <w:spacing w:before="0" w:after="160" w:line="259" w:lineRule="auto"/>
+        <w:ind w:firstLine="0"/>
+      </w:pPr>
+      <w:r>
+        <w:br w:type="page"/>
+      </w:r>
+    </w:p>
+    <w:p>
+      <w:pPr>
         <w:pStyle w:val="Figura"/>
       </w:pPr>
       <w:r>
+        <w:lastRenderedPageBreak/>
         <w:t>Tipos de cargos hoteleros</w:t>
       </w:r>
     </w:p>
     <w:p>
       <w:pPr>
-        <w:pStyle w:val="Textocomentario"/>
-      </w:pPr>
-      <w:r>
-        <w:t xml:space="preserve">Texto alternativo: </w:t>
-      </w:r>
-      <w:r>
+        <w:jc w:val="center"/>
+        <w:rPr>
+          <w:lang w:eastAsia="es-CO"/>
+        </w:rPr>
+      </w:pPr>
+      <w:r>
+        <w:rPr>
+          <w:noProof/>
+          <w:lang w:eastAsia="es-CO"/>
+        </w:rPr>
+        <w:drawing>
+          <wp:inline distT="0" distB="0" distL="0" distR="0" wp14:anchorId="3FEE17F9" wp14:editId="4DEBE7FB">
+            <wp:extent cx="4482787" cy="3133725"/>
+            <wp:effectExtent l="0" t="0" r="0" b="0"/>
+            <wp:docPr id="2" name="Imagen 2" descr="“Tipos de cargos hoteleros” organizada en tres columnas. La primera columna, “Cargos o Créditos”, incluye: Habitaciones, Teléfonos, Room service, SPA, Lavandería, Eventos y Misceláneos. La segunda columna, “Ahorros o Débitos”, presenta: Abonos, Descuentos y Ajustes. La tercera columna, “Mixtos”, contiene: Traspasos, Anulaciones y Correcciones. Cada categoría está conectada mediante flechas descendentes que muestran la relación entre los conceptos. En la parte inferior derecha aparece una ilustración de una persona junto a un edificio de hotel, una maleta y un marcador de ubicación. El diseño utiliza tonos beige, amarillo y naranja sobre un fondo gris claro. "/>
+            <wp:cNvGraphicFramePr>
+              <a:graphicFrameLocks xmlns:a="http://schemas.openxmlformats.org/drawingml/2006/main" noChangeAspect="1"/>
+            </wp:cNvGraphicFramePr>
+            <a:graphic xmlns:a="http://schemas.openxmlformats.org/drawingml/2006/main">
+              <a:graphicData uri="http://schemas.openxmlformats.org/drawingml/2006/picture">
+                <pic:pic xmlns:pic="http://schemas.openxmlformats.org/drawingml/2006/picture">
+                  <pic:nvPicPr>
+                    <pic:cNvPr id="2" name="Imagen 2" descr="“Tipos de cargos hoteleros” organizada en tres columnas. La primera columna, “Cargos o Créditos”, incluye: Habitaciones, Teléfonos, Room service, SPA, Lavandería, Eventos y Misceláneos. La segunda columna, “Ahorros o Débitos”, presenta: Abonos, Descuentos y Ajustes. La tercera columna, “Mixtos”, contiene: Traspasos, Anulaciones y Correcciones. Cada categoría está conectada mediante flechas descendentes que muestran la relación entre los conceptos. En la parte inferior derecha aparece una ilustración de una persona junto a un edificio de hotel, una maleta y un marcador de ubicación. El diseño utiliza tonos beige, amarillo y naranja sobre un fondo gris claro. "/>
+                    <pic:cNvPicPr/>
+                  </pic:nvPicPr>
+                  <pic:blipFill>
+                    <a:blip r:embed="rId12">
+                      <a:extLst>
+                        <a:ext uri="{28A0092B-C50C-407E-A947-70E740481C1C}">
+                          <a14:useLocalDpi xmlns:a14="http://schemas.microsoft.com/office/drawing/2010/main" val="0"/>
+                        </a:ext>
+                      </a:extLst>
+                    </a:blip>
+                    <a:stretch>
+                      <a:fillRect/>
+                    </a:stretch>
+                  </pic:blipFill>
+                  <pic:spPr>
+                    <a:xfrm>
+                      <a:off x="0" y="0"/>
+                      <a:ext cx="4488585" cy="3137778"/>
+                    </a:xfrm>
+                    <a:prstGeom prst="rect">
+                      <a:avLst/>
+                    </a:prstGeom>
+                  </pic:spPr>
+                </pic:pic>
+              </a:graphicData>
+            </a:graphic>
+          </wp:inline>
+        </w:drawing>
+      </w:r>
+    </w:p>
+    <w:p>
+      <w:pPr>
+        <w:ind w:left="1415"/>
+        <w:rPr>
+          <w:lang w:eastAsia="es-CO"/>
+        </w:rPr>
+      </w:pPr>
+      <w:r>
+        <w:rPr>
+          <w:lang w:eastAsia="es-CO"/>
+        </w:rPr>
+        <w:t>Nota. SENA, (2021).</w:t>
+      </w:r>
+    </w:p>
+    <w:p>
+      <w:pPr>
         <w:rPr>
           <w:b/>
           <w:bCs/>
-        </w:rPr>
-        <w:t>“Tipos de cargos hoteleros”</w:t>
-      </w:r>
-      <w:r>
-        <w:t xml:space="preserve"> organizada en tres columnas. La primera columna, </w:t>
-      </w:r>
+          <w:lang w:eastAsia="es-CO"/>
+        </w:rPr>
+      </w:pPr>
       <w:r>
         <w:rPr>
           <w:b/>
           <w:bCs/>
-        </w:rPr>
-        <w:t>“Cargos o Créditos”</w:t>
-      </w:r>
-      <w:r>
-        <w:t xml:space="preserve">, incluye: Habitaciones, Teléfonos, </w:t>
-      </w:r>
-      <w:proofErr w:type="spellStart"/>
-      <w:r>
-        <w:t>Room</w:t>
-      </w:r>
-      <w:proofErr w:type="spellEnd"/>
-      <w:r>
-        <w:t xml:space="preserve"> </w:t>
-      </w:r>
-      <w:proofErr w:type="spellStart"/>
-      <w:r>
-        <w:t>service</w:t>
-      </w:r>
-      <w:proofErr w:type="spellEnd"/>
-      <w:r>
-        <w:t xml:space="preserve">, SPA, Lavandería, Eventos y Misceláneos. La segunda columna, </w:t>
-      </w:r>
-      <w:r>
+          <w:lang w:eastAsia="es-CO"/>
+        </w:rPr>
+        <w:t>Cargos según su origen</w:t>
+      </w:r>
+    </w:p>
+    <w:p>
+      <w:pPr>
+        <w:rPr>
+          <w:lang w:eastAsia="es-CO"/>
+        </w:rPr>
+      </w:pPr>
+      <w:r>
+        <w:rPr>
+          <w:lang w:eastAsia="es-CO"/>
+        </w:rPr>
+        <w:t>Los cargos según su origen se clasifican de la siguiente manera:</w:t>
+      </w:r>
+    </w:p>
+    <w:p>
+      <w:pPr>
         <w:rPr>
           <w:b/>
           <w:bCs/>
-        </w:rPr>
-        <w:t>“Ahorros o Débitos”</w:t>
-      </w:r>
-      <w:r>
-        <w:t xml:space="preserve">, presenta: Abonos, Descuentos y Ajustes. La tercera columna, </w:t>
-      </w:r>
+          <w:lang w:eastAsia="es-CO"/>
+        </w:rPr>
+      </w:pPr>
       <w:r>
         <w:rPr>
           <w:b/>
           <w:bCs/>
-        </w:rPr>
-        <w:t>“Mixtos”</w:t>
-      </w:r>
-      <w:r>
-        <w:t xml:space="preserve">, contiene: Traspasos, Anulaciones y Correcciones. Cada categoría está conectada mediante flechas descendentes que muestran la relación entre los conceptos. En la parte inferior derecha aparece una ilustración de una persona junto a un edificio de hotel, una maleta y un marcador de ubicación. El diseño utiliza tonos beige, amarillo y naranja sobre un fondo gris claro. </w:t>
-      </w:r>
-    </w:p>
-    <w:p>
-      <w:pPr>
-        <w:rPr>
-          <w:lang w:eastAsia="es-CO"/>
-        </w:rPr>
-      </w:pPr>
-    </w:p>
-    <w:p>
-      <w:pPr>
-        <w:rPr>
-          <w:lang w:eastAsia="es-CO"/>
-        </w:rPr>
-      </w:pPr>
-    </w:p>
-    <w:p>
-      <w:pPr>
-        <w:rPr>
-          <w:lang w:eastAsia="es-CO"/>
-        </w:rPr>
-      </w:pPr>
-      <w:r>
-        <w:rPr>
-          <w:lang w:eastAsia="es-CO"/>
-        </w:rPr>
-        <w:t>Nota. SENA, (2021).</w:t>
+          <w:lang w:eastAsia="es-CO"/>
+        </w:rPr>
+        <w:t>Cargos manuales</w:t>
+      </w:r>
+    </w:p>
+    <w:p>
+      <w:pPr>
+        <w:rPr>
+          <w:lang w:eastAsia="es-CO"/>
+        </w:rPr>
+      </w:pPr>
+      <w:r>
+        <w:rPr>
+          <w:lang w:eastAsia="es-CO"/>
+        </w:rPr>
+        <w:t>Estos cargos se generan por la interacción humana con el sistema. Para ser más explícitos es un cargo realizado por un cajero, directamente en la caja de recepción.</w:t>
       </w:r>
     </w:p>
     <w:p>
@@ -3244,20 +3350,27 @@
           <w:bCs/>
           <w:lang w:eastAsia="es-CO"/>
         </w:rPr>
-        <w:t>Cargos según su origen</w:t>
-      </w:r>
-    </w:p>
-    <w:p>
-      <w:pPr>
-        <w:rPr>
-          <w:lang w:eastAsia="es-CO"/>
-        </w:rPr>
-      </w:pPr>
-      <w:r>
-        <w:rPr>
-          <w:lang w:eastAsia="es-CO"/>
-        </w:rPr>
-        <w:t>Los cargos según su origen se clasifican de la siguiente manera:</w:t>
+        <w:t>Cargos automáticos</w:t>
+      </w:r>
+    </w:p>
+    <w:p>
+      <w:pPr>
+        <w:rPr>
+          <w:lang w:eastAsia="es-CO"/>
+        </w:rPr>
+      </w:pPr>
+      <w:r>
+        <w:rPr>
+          <w:lang w:eastAsia="es-CO"/>
+        </w:rPr>
+        <w:t xml:space="preserve">Están los cargos realizados automáticamente por el sistema en el proceso de auditoría nocturna. Estos son los cargos relativos al cobro del valor del alojamiento, es </w:t>
+      </w:r>
+      <w:r>
+        <w:rPr>
+          <w:lang w:eastAsia="es-CO"/>
+        </w:rPr>
+        <w:lastRenderedPageBreak/>
+        <w:t>decir es el valor del alojamiento, los respectivos impuestos y otros cargos que pueden parametrizarse, con los planes tarifarios. Por ejemplo, el valor del desayuno, si se ofrece como incluido o el seguro hotelero.</w:t>
       </w:r>
     </w:p>
     <w:p>
@@ -3274,93 +3387,149 @@
           <w:bCs/>
           <w:lang w:eastAsia="es-CO"/>
         </w:rPr>
-        <w:t>Cargos manuales</w:t>
-      </w:r>
-    </w:p>
-    <w:p>
-      <w:pPr>
-        <w:rPr>
-          <w:lang w:eastAsia="es-CO"/>
-        </w:rPr>
-      </w:pPr>
-      <w:r>
-        <w:rPr>
-          <w:lang w:eastAsia="es-CO"/>
-        </w:rPr>
-        <w:t>Estos cargos se generan por la interacción humana con el sistema. Para ser más explícitos es un cargo realizado por un cajero, directamente en la caja de recepción.</w:t>
-      </w:r>
-    </w:p>
-    <w:p>
-      <w:pPr>
+        <w:t>Caja de ambientes</w:t>
+      </w:r>
+    </w:p>
+    <w:p>
+      <w:pPr>
+        <w:rPr>
+          <w:lang w:eastAsia="es-CO"/>
+        </w:rPr>
+      </w:pPr>
+      <w:r>
+        <w:rPr>
+          <w:lang w:eastAsia="es-CO"/>
+        </w:rPr>
+        <w:t>Estas cajas están enlazadas (se comunican por medio una interfase) al sistema PMS, principal. Son los llamados módulos POS (</w:t>
+      </w:r>
+      <w:r>
+        <w:rPr>
+          <w:rStyle w:val="Extranjerismo"/>
+          <w:lang w:eastAsia="es-CO"/>
+        </w:rPr>
+        <w:t>Point of Sale</w:t>
+      </w:r>
+      <w:r>
+        <w:rPr>
+          <w:lang w:eastAsia="es-CO"/>
+        </w:rPr>
+        <w:t>) o Puntos de venta. Están ubicados en los sitios donde huéspedes o clientes pueden realizar consumos, son conocidos como ambientes.</w:t>
+      </w:r>
+    </w:p>
+    <w:p>
+      <w:pPr>
+        <w:spacing w:before="0" w:after="160" w:line="259" w:lineRule="auto"/>
+        <w:ind w:firstLine="0"/>
+        <w:rPr>
+          <w:lang w:eastAsia="es-CO"/>
+        </w:rPr>
+      </w:pPr>
+      <w:r>
+        <w:rPr>
+          <w:lang w:eastAsia="es-CO"/>
+        </w:rPr>
+        <w:br w:type="page"/>
+      </w:r>
+    </w:p>
+    <w:p>
+      <w:pPr>
+        <w:pStyle w:val="Ttulo1"/>
+      </w:pPr>
+      <w:bookmarkStart w:id="3" w:name="_Toc231319973"/>
+      <w:r>
+        <w:lastRenderedPageBreak/>
+        <w:t>Políticas de manejo de caja</w:t>
+      </w:r>
+      <w:bookmarkEnd w:id="3"/>
+    </w:p>
+    <w:p>
+      <w:pPr>
+        <w:rPr>
+          <w:lang w:val="es-419" w:eastAsia="es-CO"/>
+        </w:rPr>
+      </w:pPr>
+      <w:r>
+        <w:rPr>
+          <w:lang w:val="es-419" w:eastAsia="es-CO"/>
+        </w:rPr>
+        <w:t>Las políticas son los preceptos que establecen normas, procedimientos y comportamientos que deben tener los empleados. En el caso del manejo de caja es muy seguro que cada empresa hotelera tenga sus propias políticas, es recomendable que los empleados de recepción y los directamente responsables de la caja las tengan totalmente claras.</w:t>
+      </w:r>
+    </w:p>
+    <w:p>
+      <w:pPr>
+        <w:rPr>
+          <w:lang w:val="es-419" w:eastAsia="es-CO"/>
+        </w:rPr>
+      </w:pPr>
+      <w:r>
         <w:rPr>
           <w:b/>
           <w:bCs/>
-          <w:lang w:eastAsia="es-CO"/>
-        </w:rPr>
-      </w:pPr>
-      <w:r>
+          <w:lang w:val="es-419" w:eastAsia="es-CO"/>
+        </w:rPr>
+        <w:t>Recuerda que</w:t>
+      </w:r>
+      <w:r>
+        <w:rPr>
+          <w:lang w:val="es-419" w:eastAsia="es-CO"/>
+        </w:rPr>
+        <w:t>:</w:t>
+      </w:r>
+    </w:p>
+    <w:p>
+      <w:pPr>
+        <w:rPr>
+          <w:lang w:val="es-419" w:eastAsia="es-CO"/>
+        </w:rPr>
+      </w:pPr>
+      <w:r>
+        <w:rPr>
+          <w:lang w:val="es-419" w:eastAsia="es-CO"/>
+        </w:rPr>
+        <w:t>En los establecimientos de alojamiento se manejan grandes cifras que pueden ser cuantiosas, por lo que el empleado debe tener un alto grado de responsabilidad.</w:t>
+      </w:r>
+    </w:p>
+    <w:p>
+      <w:pPr>
+        <w:rPr>
+          <w:lang w:val="es-419" w:eastAsia="es-CO"/>
+        </w:rPr>
+      </w:pPr>
+      <w:r>
+        <w:rPr>
+          <w:lang w:val="es-419" w:eastAsia="es-CO"/>
+        </w:rPr>
+        <w:t>A continuación, mencionamos algunas de las políticas más comunes del manejo de caja.</w:t>
+      </w:r>
+    </w:p>
+    <w:p>
+      <w:pPr>
         <w:rPr>
           <w:b/>
           <w:bCs/>
-          <w:lang w:eastAsia="es-CO"/>
-        </w:rPr>
-        <w:t>Cargos automáticos</w:t>
-      </w:r>
-    </w:p>
-    <w:p>
-      <w:pPr>
-        <w:rPr>
-          <w:lang w:eastAsia="es-CO"/>
-        </w:rPr>
-      </w:pPr>
-      <w:r>
-        <w:rPr>
-          <w:lang w:eastAsia="es-CO"/>
-        </w:rPr>
-        <w:t>Están los cargos realizados automáticamente por el sistema en el proceso de auditoría nocturna. Estos son los cargos relativos al cobro del valor del alojamiento, es decir es el valor del alojamiento, los respectivos impuestos y otros cargos que pueden parametrizarse, con los planes tarifarios. Por ejemplo, el valor del desayuno, si se ofrece como incluido o el seguro hotelero.</w:t>
-      </w:r>
-    </w:p>
-    <w:p>
-      <w:pPr>
+          <w:lang w:val="es-419" w:eastAsia="es-CO"/>
+        </w:rPr>
+      </w:pPr>
+      <w:r>
         <w:rPr>
           <w:b/>
           <w:bCs/>
-          <w:lang w:eastAsia="es-CO"/>
-        </w:rPr>
-      </w:pPr>
-      <w:r>
-        <w:rPr>
-          <w:b/>
-          <w:bCs/>
-          <w:lang w:eastAsia="es-CO"/>
-        </w:rPr>
-        <w:t>Caja de ambientes</w:t>
-      </w:r>
-    </w:p>
-    <w:p>
-      <w:pPr>
-        <w:rPr>
-          <w:lang w:eastAsia="es-CO"/>
-        </w:rPr>
-      </w:pPr>
-      <w:r>
-        <w:rPr>
-          <w:lang w:eastAsia="es-CO"/>
-        </w:rPr>
-        <w:t>Estas cajas están enlazadas (se comunican por medio una interfase) al sistema PMS, principal. Son los llamados módulos POS (</w:t>
-      </w:r>
-      <w:r>
-        <w:rPr>
-          <w:rStyle w:val="Extranjerismo"/>
-          <w:lang w:eastAsia="es-CO"/>
-        </w:rPr>
-        <w:t>Point of Sale</w:t>
-      </w:r>
-      <w:r>
-        <w:rPr>
-          <w:lang w:eastAsia="es-CO"/>
-        </w:rPr>
-        <w:t>) o Puntos de venta. Están ubicados en los sitios donde huéspedes o clientes pueden realizar consumos, son conocidos como ambientes.</w:t>
+          <w:lang w:val="es-419" w:eastAsia="es-CO"/>
+        </w:rPr>
+        <w:t>Fondo de Caja</w:t>
+      </w:r>
+    </w:p>
+    <w:p>
+      <w:pPr>
+        <w:rPr>
+          <w:lang w:val="es-419" w:eastAsia="es-CO"/>
+        </w:rPr>
+      </w:pPr>
+      <w:r>
+        <w:rPr>
+          <w:lang w:val="es-419" w:eastAsia="es-CO"/>
+        </w:rPr>
+        <w:t>A continuación, se informará detalladamente qué es un fondo de caja:</w:t>
       </w:r>
     </w:p>
     <w:p>
@@ -3368,128 +3537,28 @@
         <w:spacing w:before="0" w:after="160" w:line="259" w:lineRule="auto"/>
         <w:ind w:firstLine="0"/>
         <w:rPr>
-          <w:lang w:eastAsia="es-CO"/>
-        </w:rPr>
-      </w:pPr>
-      <w:r>
-        <w:rPr>
-          <w:lang w:eastAsia="es-CO"/>
+          <w:lang w:val="es-419" w:eastAsia="es-CO"/>
+        </w:rPr>
+      </w:pPr>
+      <w:r>
+        <w:rPr>
+          <w:lang w:val="es-419" w:eastAsia="es-CO"/>
         </w:rPr>
         <w:br w:type="page"/>
       </w:r>
     </w:p>
     <w:p>
       <w:pPr>
-        <w:pStyle w:val="Ttulo1"/>
-      </w:pPr>
-      <w:bookmarkStart w:id="3" w:name="_Toc231319973"/>
-      <w:r>
+        <w:pStyle w:val="Video"/>
+        <w:rPr>
+          <w:lang w:val="es-419" w:eastAsia="es-CO"/>
+        </w:rPr>
+      </w:pPr>
+      <w:r>
+        <w:rPr>
+          <w:lang w:val="es-419" w:eastAsia="es-CO"/>
+        </w:rPr>
         <w:lastRenderedPageBreak/>
-        <w:t>Políticas de manejo de caja</w:t>
-      </w:r>
-      <w:bookmarkEnd w:id="3"/>
-    </w:p>
-    <w:p>
-      <w:pPr>
-        <w:rPr>
-          <w:lang w:val="es-419" w:eastAsia="es-CO"/>
-        </w:rPr>
-      </w:pPr>
-      <w:r>
-        <w:rPr>
-          <w:lang w:val="es-419" w:eastAsia="es-CO"/>
-        </w:rPr>
-        <w:t>Las políticas son los preceptos que establecen normas, procedimientos y comportamientos que deben tener los empleados. En el caso del manejo de caja es muy seguro que cada empresa hotelera tenga sus propias políticas, es recomendable que los empleados de recepción y los directamente responsables de la caja las tengan totalmente claras.</w:t>
-      </w:r>
-    </w:p>
-    <w:p>
-      <w:pPr>
-        <w:rPr>
-          <w:lang w:val="es-419" w:eastAsia="es-CO"/>
-        </w:rPr>
-      </w:pPr>
-      <w:r>
-        <w:rPr>
-          <w:b/>
-          <w:bCs/>
-          <w:lang w:val="es-419" w:eastAsia="es-CO"/>
-        </w:rPr>
-        <w:t>Recuerda que</w:t>
-      </w:r>
-      <w:r>
-        <w:rPr>
-          <w:lang w:val="es-419" w:eastAsia="es-CO"/>
-        </w:rPr>
-        <w:t>:</w:t>
-      </w:r>
-    </w:p>
-    <w:p>
-      <w:pPr>
-        <w:rPr>
-          <w:lang w:val="es-419" w:eastAsia="es-CO"/>
-        </w:rPr>
-      </w:pPr>
-      <w:r>
-        <w:rPr>
-          <w:lang w:val="es-419" w:eastAsia="es-CO"/>
-        </w:rPr>
-        <w:t>En los establecimientos de alojamiento se manejan grandes cifras que pueden ser cuantiosas, por lo que el empleado debe tener un alto grado de responsabilidad.</w:t>
-      </w:r>
-    </w:p>
-    <w:p>
-      <w:pPr>
-        <w:rPr>
-          <w:lang w:val="es-419" w:eastAsia="es-CO"/>
-        </w:rPr>
-      </w:pPr>
-      <w:r>
-        <w:rPr>
-          <w:lang w:val="es-419" w:eastAsia="es-CO"/>
-        </w:rPr>
-        <w:t>A continuación, mencionamos algunas de las políticas más comunes del manejo de caja.</w:t>
-      </w:r>
-    </w:p>
-    <w:p>
-      <w:pPr>
-        <w:rPr>
-          <w:b/>
-          <w:bCs/>
-          <w:lang w:val="es-419" w:eastAsia="es-CO"/>
-        </w:rPr>
-      </w:pPr>
-      <w:r>
-        <w:rPr>
-          <w:b/>
-          <w:bCs/>
-          <w:lang w:val="es-419" w:eastAsia="es-CO"/>
-        </w:rPr>
-        <w:t>Fondo de Caja</w:t>
-      </w:r>
-    </w:p>
-    <w:p>
-      <w:pPr>
-        <w:rPr>
-          <w:lang w:val="es-419" w:eastAsia="es-CO"/>
-        </w:rPr>
-      </w:pPr>
-      <w:r>
-        <w:rPr>
-          <w:lang w:val="es-419" w:eastAsia="es-CO"/>
-        </w:rPr>
-        <w:t>A continuación, se informará detalladamente qué es un fondo de caja:</w:t>
-      </w:r>
-    </w:p>
-    <w:p>
-      <w:pPr>
-        <w:pStyle w:val="Video"/>
-        <w:rPr>
-          <w:lang w:val="es-419" w:eastAsia="es-CO"/>
-        </w:rPr>
-      </w:pPr>
-      <w:r>
-        <w:rPr>
-          <w:lang w:val="es-419" w:eastAsia="es-CO"/>
-        </w:rPr>
         <w:t>Fondo de caja o de base</w:t>
       </w:r>
     </w:p>
@@ -3504,12 +3573,11 @@
         <w:rPr>
           <w:noProof/>
         </w:rPr>
-        <w:lastRenderedPageBreak/>
         <w:drawing>
-          <wp:inline distT="0" distB="0" distL="0" distR="0" wp14:anchorId="56BDEFBA" wp14:editId="66985A98">
-            <wp:extent cx="4600575" cy="2587708"/>
-            <wp:effectExtent l="0" t="0" r="0" b="3175"/>
-            <wp:docPr id="13" name="Imagen 13">
+          <wp:inline distT="0" distB="0" distL="0" distR="0" wp14:anchorId="4457EED9" wp14:editId="48216B26">
+            <wp:extent cx="3979511" cy="2238375"/>
+            <wp:effectExtent l="0" t="0" r="2540" b="0"/>
+            <wp:docPr id="1" name="Imagen 1">
               <a:extLst xmlns:a="http://schemas.openxmlformats.org/drawingml/2006/main">
                 <a:ext uri="{C183D7F6-B498-43B3-948B-1728B52AA6E4}">
                   <adec:decorative xmlns:adec="http://schemas.microsoft.com/office/drawing/2017/decorative" val="1"/>
@@ -3523,7 +3591,7 @@
               <a:graphicData uri="http://schemas.openxmlformats.org/drawingml/2006/picture">
                 <pic:pic xmlns:pic="http://schemas.openxmlformats.org/drawingml/2006/picture">
                   <pic:nvPicPr>
-                    <pic:cNvPr id="13" name="Imagen 13">
+                    <pic:cNvPr id="1" name="Imagen 1">
                       <a:extLst>
                         <a:ext uri="{C183D7F6-B498-43B3-948B-1728B52AA6E4}">
                           <adec:decorative xmlns:adec="http://schemas.microsoft.com/office/drawing/2017/decorative" val="1"/>
@@ -3535,7 +3603,7 @@
                     </pic:cNvPicPr>
                   </pic:nvPicPr>
                   <pic:blipFill>
-                    <a:blip r:embed="rId12" cstate="print">
+                    <a:blip r:embed="rId13" cstate="print">
                       <a:extLst>
                         <a:ext uri="{28A0092B-C50C-407E-A947-70E740481C1C}">
                           <a14:useLocalDpi xmlns:a14="http://schemas.microsoft.com/office/drawing/2010/main" val="0"/>
@@ -3550,7 +3618,7 @@
                   <pic:spPr bwMode="auto">
                     <a:xfrm>
                       <a:off x="0" y="0"/>
-                      <a:ext cx="4611104" cy="2593630"/>
+                      <a:ext cx="3999880" cy="2249832"/>
                     </a:xfrm>
                     <a:prstGeom prst="rect">
                       <a:avLst/>
@@ -3577,7 +3645,7 @@
           <w:lang w:val="es-419" w:eastAsia="es-CO"/>
         </w:rPr>
       </w:pPr>
-      <w:hyperlink r:id="rId13" w:history="1">
+      <w:hyperlink r:id="rId14" w:history="1">
         <w:r>
           <w:rPr>
             <w:rStyle w:val="Hipervnculo"/>
@@ -3616,6 +3684,18 @@
               </w:rPr>
               <w:t xml:space="preserve">Transcripción del video. </w:t>
             </w:r>
+            <w:r>
+              <w:rPr>
+                <w:b/>
+              </w:rPr>
+              <w:t>Fondo de caja</w:t>
+            </w:r>
+            <w:r>
+              <w:rPr>
+                <w:b/>
+              </w:rPr>
+              <w:t xml:space="preserve"> o de base</w:t>
+            </w:r>
           </w:p>
         </w:tc>
       </w:tr>
@@ -3631,15 +3711,7 @@
           </w:p>
           <w:p>
             <w:r>
-              <w:t xml:space="preserve">La idea del fondo o base es que permanezca inalterado. Esto quiere decir que el monto que se recibe al iniciar el turno se debe regresar al finalizar la </w:t>
-            </w:r>
-            <w:proofErr w:type="gramStart"/>
-            <w:r>
-              <w:t>jornada;  para</w:t>
-            </w:r>
-            <w:proofErr w:type="gramEnd"/>
-            <w:r>
-              <w:t xml:space="preserve"> tal efecto, primero, diariamente al abrir operaciones, el cajero se registra en el sistema y acto seguido hace un depósito de dinero en el sistema PMS por el valor del fondo de recepción. </w:t>
+              <w:t xml:space="preserve">La idea del fondo o base es que permanezca inalterado. Esto quiere decir que el monto que se recibe al iniciar el turno se debe regresar al finalizar la jornada; para tal efecto, primero, diariamente al abrir operaciones, el cajero se registra en el sistema y acto seguido hace un depósito de dinero en el sistema PMS por el valor del fondo de recepción. </w:t>
             </w:r>
           </w:p>
           <w:p>
@@ -4109,7 +4181,19 @@
         <w:rPr>
           <w:lang w:val="es-419" w:eastAsia="es-CO"/>
         </w:rPr>
-        <w:t>: Aprender a calcular porcentajes, le será de gran utilidad para dividir cuentas en partes desiguales. Esta operación es relativa a la proporcionalidad matemática y se puede calcular por medio de la regla de tres.</w:t>
+        <w:t xml:space="preserve">: </w:t>
+      </w:r>
+      <w:r>
+        <w:rPr>
+          <w:lang w:val="es-419" w:eastAsia="es-CO"/>
+        </w:rPr>
+        <w:t>a</w:t>
+      </w:r>
+      <w:r>
+        <w:rPr>
+          <w:lang w:val="es-419" w:eastAsia="es-CO"/>
+        </w:rPr>
+        <w:t>prender a calcular porcentajes, le será de gran utilidad para dividir cuentas en partes desiguales. Esta operación es relativa a la proporcionalidad matemática y se puede calcular por medio de la regla de tres.</w:t>
       </w:r>
     </w:p>
     <w:p>
@@ -4381,21 +4465,7 @@
         <w:rPr>
           <w:lang w:val="es-419" w:eastAsia="es-CO"/>
         </w:rPr>
-        <w:t xml:space="preserve"> Es decir que el valor equivalente al 30 % que debe pagar el huésped es $172.200 + </w:t>
-      </w:r>
-      <w:proofErr w:type="gramStart"/>
-      <w:r>
-        <w:rPr>
-          <w:lang w:val="es-419" w:eastAsia="es-CO"/>
-        </w:rPr>
-        <w:t>IVA</w:t>
-      </w:r>
-      <w:proofErr w:type="gramEnd"/>
-      <w:r>
-        <w:rPr>
-          <w:lang w:val="es-419" w:eastAsia="es-CO"/>
-        </w:rPr>
-        <w:t xml:space="preserve"> por tanto, a la empresa se le debe cobrar el valor de $401.800 + IVA.</w:t>
+        <w:t xml:space="preserve"> Es decir que el valor equivalente al 30 % que debe pagar el huésped es $172.200 + IVA por tanto, a la empresa se le debe cobrar el valor de $401.800 + IVA.</w:t>
       </w:r>
     </w:p>
     <w:p>
@@ -4718,7 +4788,7 @@
           <w:rStyle w:val="Extranjerismo"/>
           <w:b/>
           <w:bCs/>
-          <w:lang w:eastAsia="es-CO"/>
+          <w:lang w:val="es-CO" w:eastAsia="es-CO"/>
         </w:rPr>
       </w:pPr>
       <w:r>
@@ -4726,7 +4796,7 @@
           <w:rStyle w:val="Extranjerismo"/>
           <w:b/>
           <w:bCs/>
-          <w:lang w:eastAsia="es-CO"/>
+          <w:lang w:val="es-CO" w:eastAsia="es-CO"/>
         </w:rPr>
         <w:t>Paid Out</w:t>
       </w:r>
@@ -4928,21 +4998,12 @@
                 <w:szCs w:val="28"/>
               </w:rPr>
             </w:pPr>
-            <w:proofErr w:type="gramStart"/>
             <w:r>
               <w:rPr>
                 <w:sz w:val="28"/>
                 <w:szCs w:val="28"/>
               </w:rPr>
-              <w:t>Total</w:t>
-            </w:r>
-            <w:proofErr w:type="gramEnd"/>
-            <w:r>
-              <w:rPr>
-                <w:sz w:val="28"/>
-                <w:szCs w:val="28"/>
-              </w:rPr>
-              <w:t xml:space="preserve"> a cargo del huésped</w:t>
+              <w:t>Total a cargo del huésped</w:t>
             </w:r>
           </w:p>
         </w:tc>
@@ -5073,116 +5134,127 @@
     </w:p>
     <w:p>
       <w:pPr>
-        <w:pStyle w:val="Textocomentario"/>
-      </w:pPr>
-      <w:proofErr w:type="spellStart"/>
-      <w:r>
-        <w:t>Texyo</w:t>
-      </w:r>
-      <w:proofErr w:type="spellEnd"/>
-      <w:r>
-        <w:t xml:space="preserve"> </w:t>
-      </w:r>
-      <w:proofErr w:type="spellStart"/>
-      <w:r>
-        <w:t>alt</w:t>
-      </w:r>
-      <w:proofErr w:type="spellEnd"/>
-      <w:r>
-        <w:t>: Dos ejemplos de devolución de anticipos en un hotel.</w:t>
-      </w:r>
-    </w:p>
-    <w:p>
-      <w:pPr>
-        <w:pStyle w:val="Textocomentario"/>
-      </w:pPr>
-      <w:r>
+        <w:ind w:firstLine="0"/>
+        <w:jc w:val="center"/>
+        <w:rPr>
+          <w:lang w:eastAsia="es-CO"/>
+        </w:rPr>
+      </w:pPr>
+      <w:r>
+        <w:rPr>
+          <w:noProof/>
+          <w:lang w:eastAsia="es-CO"/>
+        </w:rPr>
+        <w:drawing>
+          <wp:inline distT="0" distB="0" distL="0" distR="0" wp14:anchorId="30A26625" wp14:editId="017ADB34">
+            <wp:extent cx="5050493" cy="1658679"/>
+            <wp:effectExtent l="0" t="0" r="0" b="0"/>
+            <wp:docPr id="3" name="Gráfico 3" descr="Dos ejemplos de devolución de anticipos en un hotel.&#10;Caso A: Anticipo excede el consumo. Se muestra un anticipo reportado de $ 500.000 y un consumo total de $ 420.000. Como resultado, se genera una devolución de $ 80.000.&#10;Caso B: Devolución por tasa de cambio. Se presenta un consumo de $ 420.000 y una tasa de cambio del dólar de $3.350. El valor a pagar equivale a USD 125,38. Como el huésped entregó USD 130, se calcula una diferencia de USD 4,62. La devolución generada corresponde a $ 15.477.&#10;La información está organizada en dos recuadros paralelos con títulos resaltados en color naranja y fondo beige, facilitando la comparación entre ambos casos.&#10;"/>
+            <wp:cNvGraphicFramePr>
+              <a:graphicFrameLocks xmlns:a="http://schemas.openxmlformats.org/drawingml/2006/main" noChangeAspect="1"/>
+            </wp:cNvGraphicFramePr>
+            <a:graphic xmlns:a="http://schemas.openxmlformats.org/drawingml/2006/main">
+              <a:graphicData uri="http://schemas.openxmlformats.org/drawingml/2006/picture">
+                <pic:pic xmlns:pic="http://schemas.openxmlformats.org/drawingml/2006/picture">
+                  <pic:nvPicPr>
+                    <pic:cNvPr id="3" name="Gráfico 3" descr="Dos ejemplos de devolución de anticipos en un hotel.&#10;Caso A: Anticipo excede el consumo. Se muestra un anticipo reportado de $ 500.000 y un consumo total de $ 420.000. Como resultado, se genera una devolución de $ 80.000.&#10;Caso B: Devolución por tasa de cambio. Se presenta un consumo de $ 420.000 y una tasa de cambio del dólar de $3.350. El valor a pagar equivale a USD 125,38. Como el huésped entregó USD 130, se calcula una diferencia de USD 4,62. La devolución generada corresponde a $ 15.477.&#10;La información está organizada en dos recuadros paralelos con títulos resaltados en color naranja y fondo beige, facilitando la comparación entre ambos casos.&#10;"/>
+                    <pic:cNvPicPr/>
+                  </pic:nvPicPr>
+                  <pic:blipFill>
+                    <a:blip r:embed="rId15">
+                      <a:extLst>
+                        <a:ext uri="{28A0092B-C50C-407E-A947-70E740481C1C}">
+                          <a14:useLocalDpi xmlns:a14="http://schemas.microsoft.com/office/drawing/2010/main" val="0"/>
+                        </a:ext>
+                        <a:ext uri="{96DAC541-7B7A-43D3-8B79-37D633B846F1}">
+                          <asvg:svgBlip xmlns:asvg="http://schemas.microsoft.com/office/drawing/2016/SVG/main" r:embed="rId16"/>
+                        </a:ext>
+                      </a:extLst>
+                    </a:blip>
+                    <a:stretch>
+                      <a:fillRect/>
+                    </a:stretch>
+                  </pic:blipFill>
+                  <pic:spPr>
+                    <a:xfrm>
+                      <a:off x="0" y="0"/>
+                      <a:ext cx="5076750" cy="1667302"/>
+                    </a:xfrm>
+                    <a:prstGeom prst="rect">
+                      <a:avLst/>
+                    </a:prstGeom>
+                  </pic:spPr>
+                </pic:pic>
+              </a:graphicData>
+            </a:graphic>
+          </wp:inline>
+        </w:drawing>
+      </w:r>
+    </w:p>
+    <w:p>
+      <w:pPr>
+        <w:ind w:left="707"/>
+        <w:rPr>
+          <w:lang w:eastAsia="es-CO"/>
+        </w:rPr>
+      </w:pPr>
+      <w:r>
+        <w:rPr>
+          <w:lang w:eastAsia="es-CO"/>
+        </w:rPr>
+        <w:t>Nota. SENA, (2021).</w:t>
+      </w:r>
+    </w:p>
+    <w:p>
+      <w:pPr>
+        <w:spacing w:before="0" w:after="160" w:line="259" w:lineRule="auto"/>
+        <w:ind w:firstLine="0"/>
+        <w:rPr>
+          <w:lang w:eastAsia="es-CO"/>
+        </w:rPr>
+      </w:pPr>
+      <w:r>
+        <w:rPr>
+          <w:lang w:eastAsia="es-CO"/>
+        </w:rPr>
+        <w:br w:type="page"/>
+      </w:r>
+    </w:p>
+    <w:p>
+      <w:pPr>
         <w:rPr>
           <w:b/>
           <w:bCs/>
-        </w:rPr>
-        <w:t>Caso A: Anticipo excede el consumo.</w:t>
-      </w:r>
-      <w:r>
-        <w:t xml:space="preserve"> Se muestra un anticipo reportado de $ 500.000 y un consumo total de $ 420.000. Como resultado, se genera una devolución de $ 80.000.</w:t>
-      </w:r>
-    </w:p>
-    <w:p>
-      <w:pPr>
-        <w:pStyle w:val="Textocomentario"/>
+          <w:lang w:eastAsia="es-CO"/>
+        </w:rPr>
       </w:pPr>
       <w:r>
         <w:rPr>
           <w:b/>
           <w:bCs/>
-        </w:rPr>
-        <w:t>Caso B: Devolución por tasa de cambio.</w:t>
-      </w:r>
-      <w:r>
-        <w:t xml:space="preserve"> Se presenta un consumo de $ 420.000 y una tasa de cambio del dólar de $3.350. El valor a pagar equivale a USD 125,38. Como el huésped entregó USD 130, se calcula una diferencia de USD 4,62. La devolución generada corresponde a $ 15.477.</w:t>
-      </w:r>
-    </w:p>
-    <w:p>
-      <w:pPr>
-        <w:pStyle w:val="Textocomentario"/>
-      </w:pPr>
-      <w:r>
-        <w:t>La información está organizada en dos recuadros paralelos con títulos resaltados en color naranja y fondo beige, facilitando la comparación entre ambos casos.</w:t>
-      </w:r>
-    </w:p>
-    <w:p>
-      <w:pPr>
-        <w:rPr>
-          <w:lang w:eastAsia="es-CO"/>
-        </w:rPr>
-      </w:pPr>
-    </w:p>
-    <w:p>
-      <w:pPr>
-        <w:rPr>
-          <w:lang w:eastAsia="es-CO"/>
-        </w:rPr>
-      </w:pPr>
-    </w:p>
-    <w:p>
-      <w:pPr>
-        <w:rPr>
-          <w:lang w:eastAsia="es-CO"/>
-        </w:rPr>
-      </w:pPr>
-    </w:p>
-    <w:p>
-      <w:pPr>
-        <w:rPr>
-          <w:lang w:eastAsia="es-CO"/>
-        </w:rPr>
-      </w:pPr>
-    </w:p>
-    <w:p>
-      <w:pPr>
-        <w:rPr>
-          <w:lang w:eastAsia="es-CO"/>
-        </w:rPr>
-      </w:pPr>
-    </w:p>
-    <w:p>
-      <w:pPr>
-        <w:rPr>
-          <w:lang w:eastAsia="es-CO"/>
-        </w:rPr>
-      </w:pPr>
-    </w:p>
-    <w:p>
-      <w:pPr>
-        <w:rPr>
-          <w:lang w:eastAsia="es-CO"/>
-        </w:rPr>
-      </w:pPr>
-      <w:r>
-        <w:rPr>
-          <w:lang w:eastAsia="es-CO"/>
-        </w:rPr>
-        <w:t>Nota. SENA, (2021).</w:t>
+          <w:lang w:eastAsia="es-CO"/>
+        </w:rPr>
+        <w:lastRenderedPageBreak/>
+        <w:t>Documentos de soporte</w:t>
+      </w:r>
+    </w:p>
+    <w:p>
+      <w:pPr>
+        <w:rPr>
+          <w:lang w:eastAsia="es-CO"/>
+        </w:rPr>
+      </w:pPr>
+      <w:r>
+        <w:rPr>
+          <w:lang w:eastAsia="es-CO"/>
+        </w:rPr>
+        <w:t>Los documentos de soporte son registros que respaldan y evidencian las transacciones realizadas durante la estadía del huésped. Estos documentos permiten garantizar la trazabilidad de los movimientos efectuados en la cuenta, facilitar los procesos de control y verificación, y asegurar la correcta gestión administrativa y financiera del establecimiento. Como resultado de las operaciones registradas en el plan de cuentas y los movimientos generados en la cuenta huésped, se producen diversos documentos de soporte, entre los cuales se encuentran los descritos por Peña (2010)</w:t>
+      </w:r>
+      <w:r>
+        <w:rPr>
+          <w:lang w:eastAsia="es-CO"/>
+        </w:rPr>
+        <w:t>.</w:t>
       </w:r>
     </w:p>
     <w:p>
@@ -5199,36 +5271,6 @@
           <w:bCs/>
           <w:lang w:eastAsia="es-CO"/>
         </w:rPr>
-        <w:t>Documentos de soporte</w:t>
-      </w:r>
-    </w:p>
-    <w:p>
-      <w:pPr>
-        <w:rPr>
-          <w:lang w:eastAsia="es-CO"/>
-        </w:rPr>
-      </w:pPr>
-      <w:r>
-        <w:rPr>
-          <w:lang w:eastAsia="es-CO"/>
-        </w:rPr>
-        <w:t>Los documentos de soporte son registros que respaldan y evidencian las transacciones realizadas durante la estadía del huésped. Estos documentos permiten garantizar la trazabilidad de los movimientos efectuados en la cuenta, facilitar los procesos de control y verificación, y asegurar la correcta gestión administrativa y financiera del establecimiento. Como resultado de las operaciones registradas en el plan de cuentas y los movimientos generados en la cuenta huésped, se producen diversos documentos de soporte, entre los cuales se encuentran los descritos por Peña (2010):</w:t>
-      </w:r>
-    </w:p>
-    <w:p>
-      <w:pPr>
-        <w:rPr>
-          <w:b/>
-          <w:bCs/>
-          <w:lang w:eastAsia="es-CO"/>
-        </w:rPr>
-      </w:pPr>
-      <w:r>
-        <w:rPr>
-          <w:b/>
-          <w:bCs/>
-          <w:lang w:eastAsia="es-CO"/>
-        </w:rPr>
         <w:t>Soportes de débito</w:t>
       </w:r>
     </w:p>
@@ -5242,7 +5284,19 @@
         <w:rPr>
           <w:lang w:eastAsia="es-CO"/>
         </w:rPr>
-        <w:t>Los movimientos de débito, como lo menciona Peña (2010) es decir los que aumentan la cuenta del cliente, deben tener como soporte, comandas o soportes de consumo debidamente firmadas por:</w:t>
+        <w:t>Los movimientos de débito, como lo menciona Peña (2010)</w:t>
+      </w:r>
+      <w:r>
+        <w:rPr>
+          <w:lang w:eastAsia="es-CO"/>
+        </w:rPr>
+        <w:t>,</w:t>
+      </w:r>
+      <w:r>
+        <w:rPr>
+          <w:lang w:eastAsia="es-CO"/>
+        </w:rPr>
+        <w:t xml:space="preserve"> es decir los que aumentan la cuenta del cliente, deben tener como soporte, comandas o soportes de consumo debidamente firmadas por:</w:t>
       </w:r>
     </w:p>
     <w:p>
@@ -5327,7 +5381,6 @@
         <w:rPr>
           <w:lang w:eastAsia="es-CO"/>
         </w:rPr>
-        <w:lastRenderedPageBreak/>
         <w:t>Cargos por anticipos a huéspedes (en caso de que esté contemplado dentro de las políticas del hotel).</w:t>
       </w:r>
     </w:p>
@@ -5400,16 +5453,9 @@
         <w:rPr>
           <w:lang w:eastAsia="es-CO"/>
         </w:rPr>
-        <w:t>Transferencias de naturaleza débito (cargos asumidos de otras cuentas</w:t>
-      </w:r>
-      <w:proofErr w:type="gramStart"/>
-      <w:r>
-        <w:rPr>
-          <w:lang w:eastAsia="es-CO"/>
-        </w:rPr>
-        <w:t>)..</w:t>
-      </w:r>
-      <w:proofErr w:type="gramEnd"/>
+        <w:lastRenderedPageBreak/>
+        <w:t>Transferencias de naturaleza débito (cargos asumidos de otras cuentas).</w:t>
+      </w:r>
     </w:p>
     <w:p>
       <w:pPr>
@@ -5621,7 +5667,6 @@
         <w:rPr>
           <w:lang w:eastAsia="es-CO"/>
         </w:rPr>
-        <w:lastRenderedPageBreak/>
         <w:t>Cancelación de la cuenta (efectivo, moneda extranjera, tarjetas de crédito, cartera con empresas, agencias de viajes y particulares).</w:t>
       </w:r>
     </w:p>
@@ -6213,7 +6258,7 @@
           <w:bCs/>
           <w:lang w:val="es-419" w:eastAsia="es-CO"/>
         </w:rPr>
-        <w:t>Parágrafo:</w:t>
+        <w:t>Parágrafo</w:t>
       </w:r>
     </w:p>
     <w:p>
@@ -6243,7 +6288,7 @@
           <w:bCs/>
           <w:lang w:val="es-419" w:eastAsia="es-CO"/>
         </w:rPr>
-        <w:t>Parágrafo:</w:t>
+        <w:t>Parágrafo</w:t>
       </w:r>
     </w:p>
     <w:p>
@@ -6533,7 +6578,19 @@
           <w:lang w:val="es-419" w:eastAsia="es-CO"/>
         </w:rPr>
         <w:lastRenderedPageBreak/>
-        <w:t>En los sistemas informáticos PMS, esta tarea es muy sencilla, ya que solo se debe marcar el cargo y pasarlo a otra ventana (así se conocen los subfolios dentro de la misma cuenta) Si no se utiliza sistema PMS, la tarea será un poco más engorrosa, ya que debe hacerse manualmente, y seguro bajo presión de tiempo al momento de la salida.</w:t>
+        <w:t>En los sistemas informáticos PMS, esta tarea es muy sencilla, ya que solo se debe marcar el cargo y pasarlo a otra ventana (así se conocen los subfolios dentro de la misma cuenta)</w:t>
+      </w:r>
+      <w:r>
+        <w:rPr>
+          <w:lang w:val="es-419" w:eastAsia="es-CO"/>
+        </w:rPr>
+        <w:t>.</w:t>
+      </w:r>
+      <w:r>
+        <w:rPr>
+          <w:lang w:val="es-419" w:eastAsia="es-CO"/>
+        </w:rPr>
+        <w:t xml:space="preserve"> Si no se utiliza sistema PMS, la tarea será un poco más engorrosa, ya que debe hacerse manualmente, y seguro bajo presión de tiempo al momento de la salida.</w:t>
       </w:r>
     </w:p>
     <w:p/>
@@ -6588,204 +6645,63 @@
     </w:p>
     <w:p>
       <w:pPr>
-        <w:pStyle w:val="Textocomentario"/>
-      </w:pPr>
-      <w:r>
-        <w:rPr>
-          <w:b/>
-          <w:bCs/>
-        </w:rPr>
-        <w:t xml:space="preserve">Texto alternativo </w:t>
-      </w:r>
-    </w:p>
-    <w:p>
-      <w:pPr>
-        <w:pStyle w:val="Textocomentario"/>
-      </w:pPr>
-      <w:r>
-        <w:t xml:space="preserve">Diagrama jerárquico titulado </w:t>
-      </w:r>
-      <w:r>
-        <w:rPr>
-          <w:b/>
-          <w:bCs/>
-        </w:rPr>
-        <w:t>“Gestión financiera hotelera”</w:t>
-      </w:r>
-      <w:r>
-        <w:t xml:space="preserve">. En el nivel superior se ubica el tema central, del cual se desprenden cinco componentes principales: </w:t>
-      </w:r>
-      <w:r>
-        <w:rPr>
-          <w:b/>
-          <w:bCs/>
-        </w:rPr>
-        <w:t>Normatividad tributaria</w:t>
-      </w:r>
-      <w:r>
-        <w:t xml:space="preserve">, </w:t>
-      </w:r>
-      <w:r>
-        <w:rPr>
-          <w:b/>
-          <w:bCs/>
-        </w:rPr>
-        <w:t>Posteo hotelero</w:t>
-      </w:r>
-      <w:r>
-        <w:t xml:space="preserve">, </w:t>
-      </w:r>
-      <w:r>
-        <w:rPr>
-          <w:b/>
-          <w:bCs/>
-        </w:rPr>
-        <w:t>Manejo de caja</w:t>
-      </w:r>
-      <w:r>
-        <w:t xml:space="preserve">, </w:t>
-      </w:r>
-      <w:r>
-        <w:rPr>
-          <w:b/>
-          <w:bCs/>
-        </w:rPr>
-        <w:t>Cuenta huésped</w:t>
-      </w:r>
-      <w:r>
-        <w:t xml:space="preserve"> y </w:t>
-      </w:r>
-      <w:r>
-        <w:rPr>
-          <w:b/>
-          <w:bCs/>
-        </w:rPr>
-        <w:t>Facturación</w:t>
-      </w:r>
-      <w:r>
-        <w:t>.</w:t>
-      </w:r>
-    </w:p>
-    <w:p>
-      <w:pPr>
-        <w:pStyle w:val="Textocomentario"/>
-      </w:pPr>
-      <w:r>
-        <w:t xml:space="preserve">La rama de </w:t>
-      </w:r>
-      <w:r>
-        <w:rPr>
-          <w:b/>
-          <w:bCs/>
-        </w:rPr>
-        <w:t>Normatividad tributaria</w:t>
-      </w:r>
-      <w:r>
-        <w:t xml:space="preserve"> incluye los impuestos que impactan la operación hotelera: IVA, impuesto al consumo e impuesto de renta. </w:t>
-      </w:r>
-      <w:r>
-        <w:rPr>
-          <w:b/>
-          <w:bCs/>
-        </w:rPr>
-        <w:t>Posteo hotelero</w:t>
-      </w:r>
-      <w:r>
-        <w:t xml:space="preserve"> comprende los procesos de registro de cargos, incluyendo cargos manuales, cargos automáticos y movimientos generados desde los puntos de venta o ambientes del hotel. </w:t>
-      </w:r>
-      <w:r>
-        <w:rPr>
-          <w:b/>
-          <w:bCs/>
-        </w:rPr>
-        <w:t>Manejo de caja</w:t>
-      </w:r>
-      <w:r>
-        <w:t xml:space="preserve"> agrupa elementos de control como el fondo de caja, los arqueos, los saldos elevados y las políticas operativas relacionadas con el efectivo.</w:t>
-      </w:r>
-    </w:p>
-    <w:p>
-      <w:pPr>
-        <w:pStyle w:val="Textocomentario"/>
-      </w:pPr>
-      <w:r>
-        <w:t xml:space="preserve">La sección de </w:t>
-      </w:r>
-      <w:r>
-        <w:rPr>
-          <w:b/>
-          <w:bCs/>
-        </w:rPr>
-        <w:t>Cuenta huésped</w:t>
-      </w:r>
-      <w:r>
-        <w:t xml:space="preserve"> presenta los movimientos financieros asociados a la estadía del cliente, incluyendo débitos, créditos y tipos de cargos como abonos, anticipos, depósitos, </w:t>
-      </w:r>
-      <w:proofErr w:type="spellStart"/>
-      <w:r>
-        <w:rPr>
-          <w:i/>
-          <w:iCs/>
-        </w:rPr>
-        <w:t>paid</w:t>
-      </w:r>
-      <w:proofErr w:type="spellEnd"/>
-      <w:r>
-        <w:rPr>
-          <w:i/>
-          <w:iCs/>
-        </w:rPr>
-        <w:t xml:space="preserve"> </w:t>
-      </w:r>
-      <w:proofErr w:type="spellStart"/>
-      <w:r>
-        <w:rPr>
-          <w:i/>
-          <w:iCs/>
-        </w:rPr>
-        <w:t>out</w:t>
-      </w:r>
-      <w:proofErr w:type="spellEnd"/>
-      <w:r>
-        <w:rPr>
-          <w:i/>
-          <w:iCs/>
-        </w:rPr>
-        <w:t>,</w:t>
-      </w:r>
-      <w:r>
-        <w:t xml:space="preserve"> avances en efectivo y devoluciones. Además, incorpora los documentos de soporte que respaldan las transacciones, diferenciando </w:t>
-      </w:r>
-      <w:r>
+        <w:jc w:val="center"/>
+        <w:rPr>
+          <w:noProof/>
+          <w:lang w:eastAsia="es-CO"/>
+        </w:rPr>
+      </w:pPr>
+      <w:r>
+        <w:rPr>
+          <w:noProof/>
+          <w:lang w:eastAsia="es-CO"/>
+        </w:rPr>
         <w:lastRenderedPageBreak/>
-        <w:t xml:space="preserve">entre soportes de débito y soportes de crédito. Finalmente, </w:t>
-      </w:r>
-      <w:r>
-        <w:rPr>
-          <w:b/>
-          <w:bCs/>
-        </w:rPr>
-        <w:t>Facturación</w:t>
-      </w:r>
-      <w:r>
-        <w:t xml:space="preserve"> reúne los aspectos relacionados con la obligación de facturar, los requisitos legales y la facturación electrónica.</w:t>
-      </w:r>
-    </w:p>
-    <w:p>
-      <w:pPr>
-        <w:pStyle w:val="Textocomentario"/>
-      </w:pPr>
-      <w:r>
-        <w:t>En conjunto, el diagrama muestra cómo estos componentes se articulan para garantizar el control, la trazabilidad y la correcta gestión financiera de las operaciones hoteleras.</w:t>
-      </w:r>
-    </w:p>
-    <w:p>
-      <w:pPr>
-        <w:rPr>
-          <w:noProof/>
-          <w:lang w:eastAsia="es-CO"/>
-        </w:rPr>
-      </w:pPr>
+        <w:drawing>
+          <wp:inline distT="0" distB="0" distL="0" distR="0" wp14:anchorId="4F8A3F56" wp14:editId="1F0B80B1">
+            <wp:extent cx="5788325" cy="5927054"/>
+            <wp:effectExtent l="0" t="0" r="3175" b="0"/>
+            <wp:docPr id="5" name="Gráfico 5" descr="Diagrama jerárquico titulado “Gestión financiera hotelera”. En el nivel superior se ubica el tema central, del cual se desprenden cinco componentes principales: Normatividad tributaria, Posteo hotelero, Manejo de caja, Cuenta huésped y Facturación.&#10;La rama de Normatividad tributaria incluye los impuestos que impactan la operación hotelera: IVA, impuesto al consumo e impuesto de renta. Posteo hotelero comprende los procesos de registro de cargos, incluyendo cargos manuales, cargos automáticos y movimientos generados desde los puntos de venta o ambientes del hotel. Manejo de caja agrupa elementos de control como el fondo de caja, los arqueos, los saldos elevados y las políticas operativas relacionadas con el efectivo.&#10;La sección de Cuenta huésped presenta los movimientos financieros asociados a la estadía del cliente, incluyendo débitos, créditos y tipos de cargos como abonos, anticipos, depósitos, paid out, avances en efectivo y devoluciones. Además, incorpora los documentos de soporte que respaldan las transacciones, diferenciando entre soportes de débito y soportes de crédito. Finalmente, Facturación reúne los aspectos relacionados con la obligación de facturar, los requisitos legales y la facturación electrónica.&#10;En conjunto, el diagrama muestra cómo estos componentes se articulan para garantizar el control, la trazabilidad y la correcta gestión financiera de las operaciones hoteleras.&#10;"/>
+            <wp:cNvGraphicFramePr>
+              <a:graphicFrameLocks xmlns:a="http://schemas.openxmlformats.org/drawingml/2006/main" noChangeAspect="1"/>
+            </wp:cNvGraphicFramePr>
+            <a:graphic xmlns:a="http://schemas.openxmlformats.org/drawingml/2006/main">
+              <a:graphicData uri="http://schemas.openxmlformats.org/drawingml/2006/picture">
+                <pic:pic xmlns:pic="http://schemas.openxmlformats.org/drawingml/2006/picture">
+                  <pic:nvPicPr>
+                    <pic:cNvPr id="5" name="Gráfico 5" descr="Diagrama jerárquico titulado “Gestión financiera hotelera”. En el nivel superior se ubica el tema central, del cual se desprenden cinco componentes principales: Normatividad tributaria, Posteo hotelero, Manejo de caja, Cuenta huésped y Facturación.&#10;La rama de Normatividad tributaria incluye los impuestos que impactan la operación hotelera: IVA, impuesto al consumo e impuesto de renta. Posteo hotelero comprende los procesos de registro de cargos, incluyendo cargos manuales, cargos automáticos y movimientos generados desde los puntos de venta o ambientes del hotel. Manejo de caja agrupa elementos de control como el fondo de caja, los arqueos, los saldos elevados y las políticas operativas relacionadas con el efectivo.&#10;La sección de Cuenta huésped presenta los movimientos financieros asociados a la estadía del cliente, incluyendo débitos, créditos y tipos de cargos como abonos, anticipos, depósitos, paid out, avances en efectivo y devoluciones. Además, incorpora los documentos de soporte que respaldan las transacciones, diferenciando entre soportes de débito y soportes de crédito. Finalmente, Facturación reúne los aspectos relacionados con la obligación de facturar, los requisitos legales y la facturación electrónica.&#10;En conjunto, el diagrama muestra cómo estos componentes se articulan para garantizar el control, la trazabilidad y la correcta gestión financiera de las operaciones hoteleras.&#10;"/>
+                    <pic:cNvPicPr/>
+                  </pic:nvPicPr>
+                  <pic:blipFill>
+                    <a:blip r:embed="rId17">
+                      <a:extLst>
+                        <a:ext uri="{28A0092B-C50C-407E-A947-70E740481C1C}">
+                          <a14:useLocalDpi xmlns:a14="http://schemas.microsoft.com/office/drawing/2010/main" val="0"/>
+                        </a:ext>
+                        <a:ext uri="{96DAC541-7B7A-43D3-8B79-37D633B846F1}">
+                          <asvg:svgBlip xmlns:asvg="http://schemas.microsoft.com/office/drawing/2016/SVG/main" r:embed="rId18"/>
+                        </a:ext>
+                      </a:extLst>
+                    </a:blip>
+                    <a:stretch>
+                      <a:fillRect/>
+                    </a:stretch>
+                  </pic:blipFill>
+                  <pic:spPr>
+                    <a:xfrm>
+                      <a:off x="0" y="0"/>
+                      <a:ext cx="5790172" cy="5928946"/>
+                    </a:xfrm>
+                    <a:prstGeom prst="rect">
+                      <a:avLst/>
+                    </a:prstGeom>
+                  </pic:spPr>
+                </pic:pic>
+              </a:graphicData>
+            </a:graphic>
+          </wp:inline>
+        </w:drawing>
+      </w:r>
     </w:p>
     <w:p>
       <w:pPr>
@@ -6898,7 +6814,7 @@
       <w:r>
         <w:t xml:space="preserve">Actualícese. (2018). Beneficio tributario para hoteles en municipios con menos de 200.000 habitantes no necesita decreto. Actualícese. </w:t>
       </w:r>
-      <w:hyperlink r:id="rId14" w:history="1">
+      <w:hyperlink r:id="rId19" w:history="1">
         <w:r>
           <w:rPr>
             <w:rStyle w:val="Hipervnculo"/>
@@ -6919,7 +6835,7 @@
       <w:r>
         <w:t xml:space="preserve">DIAN. (s.f.). Obligados a facturar. Impuestos. </w:t>
       </w:r>
-      <w:hyperlink r:id="rId15" w:history="1">
+      <w:hyperlink r:id="rId20" w:history="1">
         <w:r>
           <w:rPr>
             <w:rStyle w:val="Hipervnculo"/>
@@ -6932,7 +6848,7 @@
       <w:r>
         <w:t xml:space="preserve">Gerencie.com. (2020). Requisitos de la factura de venta. Gerencie.com </w:t>
       </w:r>
-      <w:hyperlink r:id="rId16" w:history="1">
+      <w:hyperlink r:id="rId21" w:history="1">
         <w:r>
           <w:rPr>
             <w:rStyle w:val="Hipervnculo"/>
@@ -6945,7 +6861,7 @@
       <w:r>
         <w:t xml:space="preserve">Ministerio de Hacienda. (2016). Tabla IVA Canasta familiar. DIAN. (2016). Tabla IVA Canasta Familiar. </w:t>
       </w:r>
-      <w:hyperlink r:id="rId17" w:history="1">
+      <w:hyperlink r:id="rId22" w:history="1">
         <w:r>
           <w:rPr>
             <w:rStyle w:val="Hipervnculo"/>
@@ -6963,24 +6879,10 @@
       <w:r>
         <w:t xml:space="preserve">Peña, A. (2010). Contabilidad hotelera, de restaurantes y de gestión. Cartagena: Universidad Libre. </w:t>
       </w:r>
-      <w:hyperlink r:id="rId18" w:history="1">
-        <w:r>
-          <w:rPr>
-            <w:rStyle w:val="Hipervnculo"/>
-          </w:rPr>
-          <w:t>http://www.unilibre.edu.co/cartagena/pdf/investigacion/libros/ceac/CONTABILIDAD_HOTELERA_DE_RESTAURANTES_Y_DE_GESTION.pdf</w:t>
-        </w:r>
-      </w:hyperlink>
-    </w:p>
-    <w:p>
-      <w:proofErr w:type="spellStart"/>
-      <w:r>
-        <w:lastRenderedPageBreak/>
-        <w:t>Scheel</w:t>
-      </w:r>
-      <w:proofErr w:type="spellEnd"/>
-      <w:r>
-        <w:t>, A. (1992). Control de alojamiento y contabilidad de huéspedes. Bogotá: Edinter.</w:t>
+    </w:p>
+    <w:p>
+      <w:r>
+        <w:t>Scheel, A. (1992). Control de alojamiento y contabilidad de huéspedes. Bogotá: Edinter.</w:t>
       </w:r>
     </w:p>
     <w:p>
@@ -7136,7 +7038,7 @@
               <w:rPr>
                 <w:lang w:val="es-CO"/>
               </w:rPr>
-              <w:t>Responsable del ecosistema</w:t>
+              <w:t>Profesional 06. Responsable Ecosistema Virtual de Recursos Educativos Digitales</w:t>
             </w:r>
           </w:p>
         </w:tc>
@@ -7401,7 +7303,7 @@
               <w:rPr>
                 <w:lang w:val="es-CO"/>
               </w:rPr>
-              <w:t>Carmen Alicia Martínez Torres</w:t>
+              <w:t>Andrés Felipe Herrera Roldan</w:t>
             </w:r>
           </w:p>
         </w:tc>
@@ -7472,7 +7374,7 @@
               <w:rPr>
                 <w:lang w:val="es-CO"/>
               </w:rPr>
-              <w:t>Álvaro Guillermo Araújo Angarita</w:t>
+              <w:t>Fabio Fonseca Arguelles</w:t>
             </w:r>
           </w:p>
         </w:tc>
@@ -7907,8 +7809,8 @@
       </w:pPr>
     </w:p>
     <w:sectPr>
-      <w:headerReference w:type="default" r:id="rId19"/>
-      <w:footerReference w:type="default" r:id="rId20"/>
+      <w:headerReference w:type="default" r:id="rId23"/>
+      <w:footerReference w:type="default" r:id="rId24"/>
       <w:pgSz w:w="12240" w:h="15840"/>
       <w:pgMar w:top="1701" w:right="1134" w:bottom="1134" w:left="1134" w:header="709" w:footer="737" w:gutter="0"/>
       <w:pgNumType w:start="1"/>
@@ -13704,6 +13606,30 @@
 </file>
 
 <file path=customXml/item1.xml><?xml version="1.0" encoding="utf-8"?>
+<p:properties xmlns:p="http://schemas.microsoft.com/office/2006/metadata/properties" xmlns:xsi="http://www.w3.org/2001/XMLSchema-instance" xmlns:pc="http://schemas.microsoft.com/office/infopath/2007/PartnerControls">
+  <documentManagement>
+    <TaxCatchAll xmlns="13c90a0b-73bc-4dc0-be5f-28d77b615beb" xsi:nil="true"/>
+    <lcf76f155ced4ddcb4097134ff3c332f xmlns="13c93bba-48ce-428c-bfe5-88b42c19b028">
+      <Terms xmlns="http://schemas.microsoft.com/office/infopath/2007/PartnerControls"/>
+    </lcf76f155ced4ddcb4097134ff3c332f>
+  </documentManagement>
+</p:properties>
+</file>
+
+<file path=customXml/item2.xml><?xml version="1.0" encoding="utf-8"?>
+<?mso-contentType ?>
+<FormTemplates xmlns="http://schemas.microsoft.com/sharepoint/v3/contenttype/forms">
+  <Display>DocumentLibraryForm</Display>
+  <Edit>DocumentLibraryForm</Edit>
+  <New>DocumentLibraryForm</New>
+</FormTemplates>
+</file>
+
+<file path=customXml/item3.xml><?xml version="1.0" encoding="utf-8"?>
+<b:Sources xmlns:b="http://schemas.openxmlformats.org/officeDocument/2006/bibliography" xmlns="http://schemas.openxmlformats.org/officeDocument/2006/bibliography" SelectedStyle="\APASixthEditionOfficeOnline.xsl" StyleName="APA" Version="6"/>
+</file>
+
+<file path=customXml/item4.xml><?xml version="1.0" encoding="utf-8"?>
 <ct:contentTypeSchema xmlns:ct="http://schemas.microsoft.com/office/2006/metadata/contentType" xmlns:ma="http://schemas.microsoft.com/office/2006/metadata/properties/metaAttributes" ct:_="" ma:_="" ma:contentTypeName="Documento" ma:contentTypeID="0x0101006A81D6BD42E8DF4C91013959704817E1" ma:contentTypeVersion="15" ma:contentTypeDescription="Crear nuevo documento." ma:contentTypeScope="" ma:versionID="bf4f72ffd194f0963ff564daca6869f7">
   <xsd:schema xmlns:xsd="http://www.w3.org/2001/XMLSchema" xmlns:xs="http://www.w3.org/2001/XMLSchema" xmlns:p="http://schemas.microsoft.com/office/2006/metadata/properties" xmlns:ns2="13c90a0b-73bc-4dc0-be5f-28d77b615beb" xmlns:ns3="13c93bba-48ce-428c-bfe5-88b42c19b028" targetNamespace="http://schemas.microsoft.com/office/2006/metadata/properties" ma:root="true" ma:fieldsID="8718d6f4873a5b1392a45044efa78385" ns2:_="" ns3:_="">
     <xsd:import namespace="13c90a0b-73bc-4dc0-be5f-28d77b615beb"/>
@@ -13938,31 +13864,34 @@
 </ct:contentTypeSchema>
 </file>
 
-<file path=customXml/item2.xml><?xml version="1.0" encoding="utf-8"?>
-<b:Sources xmlns:b="http://schemas.openxmlformats.org/officeDocument/2006/bibliography" xmlns="http://schemas.openxmlformats.org/officeDocument/2006/bibliography" SelectedStyle="\APASixthEditionOfficeOnline.xsl" StyleName="APA" Version="6"/>
+<file path=customXml/itemProps1.xml><?xml version="1.0" encoding="utf-8"?>
+<ds:datastoreItem xmlns:ds="http://schemas.openxmlformats.org/officeDocument/2006/customXml" ds:itemID="{1279454D-02BE-4A9C-A117-DCD1573E2608}">
+  <ds:schemaRefs>
+    <ds:schemaRef ds:uri="http://schemas.microsoft.com/office/2006/metadata/properties"/>
+    <ds:schemaRef ds:uri="http://schemas.microsoft.com/office/infopath/2007/PartnerControls"/>
+    <ds:schemaRef ds:uri="13c90a0b-73bc-4dc0-be5f-28d77b615beb"/>
+    <ds:schemaRef ds:uri="13c93bba-48ce-428c-bfe5-88b42c19b028"/>
+  </ds:schemaRefs>
+</ds:datastoreItem>
 </file>
 
-<file path=customXml/item3.xml><?xml version="1.0" encoding="utf-8"?>
-<?mso-contentType ?>
-<FormTemplates xmlns="http://schemas.microsoft.com/sharepoint/v3/contenttype/forms">
-  <Display>DocumentLibraryForm</Display>
-  <Edit>DocumentLibraryForm</Edit>
-  <New>DocumentLibraryForm</New>
-</FormTemplates>
+<file path=customXml/itemProps2.xml><?xml version="1.0" encoding="utf-8"?>
+<ds:datastoreItem xmlns:ds="http://schemas.openxmlformats.org/officeDocument/2006/customXml" ds:itemID="{10663269-2064-4804-8290-36D4A57F5557}">
+  <ds:schemaRefs>
+    <ds:schemaRef ds:uri="http://schemas.microsoft.com/sharepoint/v3/contenttype/forms"/>
+  </ds:schemaRefs>
+</ds:datastoreItem>
 </file>
 
-<file path=customXml/item4.xml><?xml version="1.0" encoding="utf-8"?>
-<p:properties xmlns:p="http://schemas.microsoft.com/office/2006/metadata/properties" xmlns:xsi="http://www.w3.org/2001/XMLSchema-instance" xmlns:pc="http://schemas.microsoft.com/office/infopath/2007/PartnerControls">
-  <documentManagement>
-    <TaxCatchAll xmlns="13c90a0b-73bc-4dc0-be5f-28d77b615beb" xsi:nil="true"/>
-    <lcf76f155ced4ddcb4097134ff3c332f xmlns="13c93bba-48ce-428c-bfe5-88b42c19b028">
-      <Terms xmlns="http://schemas.microsoft.com/office/infopath/2007/PartnerControls"/>
-    </lcf76f155ced4ddcb4097134ff3c332f>
-  </documentManagement>
-</p:properties>
+<file path=customXml/itemProps3.xml><?xml version="1.0" encoding="utf-8"?>
+<ds:datastoreItem xmlns:ds="http://schemas.openxmlformats.org/officeDocument/2006/customXml" ds:itemID="{EAE431FD-7059-4C09-804B-C9D69EB7B213}">
+  <ds:schemaRefs>
+    <ds:schemaRef ds:uri="http://schemas.openxmlformats.org/officeDocument/2006/bibliography"/>
+  </ds:schemaRefs>
+</ds:datastoreItem>
 </file>
 
-<file path=customXml/itemProps1.xml><?xml version="1.0" encoding="utf-8"?>
+<file path=customXml/itemProps4.xml><?xml version="1.0" encoding="utf-8"?>
 <ds:datastoreItem xmlns:ds="http://schemas.openxmlformats.org/officeDocument/2006/customXml" ds:itemID="{9C14B031-69D2-4815-A77A-60B4EECF27A0}">
   <ds:schemaRefs>
     <ds:schemaRef ds:uri="http://schemas.microsoft.com/office/2006/metadata/contentType"/>
@@ -13979,31 +13908,4 @@
     <ds:schemaRef ds:uri="http://schemas.microsoft.com/internal/obd"/>
   </ds:schemaRefs>
 </ds:datastoreItem>
-</file>
-
-<file path=customXml/itemProps2.xml><?xml version="1.0" encoding="utf-8"?>
-<ds:datastoreItem xmlns:ds="http://schemas.openxmlformats.org/officeDocument/2006/customXml" ds:itemID="{EAE431FD-7059-4C09-804B-C9D69EB7B213}">
-  <ds:schemaRefs>
-    <ds:schemaRef ds:uri="http://schemas.openxmlformats.org/officeDocument/2006/bibliography"/>
-  </ds:schemaRefs>
-</ds:datastoreItem>
-</file>
-
-<file path=customXml/itemProps3.xml><?xml version="1.0" encoding="utf-8"?>
-<ds:datastoreItem xmlns:ds="http://schemas.openxmlformats.org/officeDocument/2006/customXml" ds:itemID="{10663269-2064-4804-8290-36D4A57F5557}">
-  <ds:schemaRefs>
-    <ds:schemaRef ds:uri="http://schemas.microsoft.com/sharepoint/v3/contenttype/forms"/>
-  </ds:schemaRefs>
-</ds:datastoreItem>
-</file>
-
-<file path=customXml/itemProps4.xml><?xml version="1.0" encoding="utf-8"?>
-<ds:datastoreItem xmlns:ds="http://schemas.openxmlformats.org/officeDocument/2006/customXml" ds:itemID="{1279454D-02BE-4A9C-A117-DCD1573E2608}">
-  <ds:schemaRefs>
-    <ds:schemaRef ds:uri="http://schemas.microsoft.com/office/2006/metadata/properties"/>
-    <ds:schemaRef ds:uri="http://schemas.microsoft.com/office/infopath/2007/PartnerControls"/>
-    <ds:schemaRef ds:uri="13c90a0b-73bc-4dc0-be5f-28d77b615beb"/>
-    <ds:schemaRef ds:uri="13c93bba-48ce-428c-bfe5-88b42c19b028"/>
-  </ds:schemaRefs>
-</ds:datastoreItem>
 </file>
</xml_diff>